<commit_message>
Add the in-block structure: launch, pomodoro academics, life skills workshop
The two-hour block is the complete Alpha day in miniature, not straight
academics: 10-minute Limitless launch, two 25-minute academic sessions
on Timeback (one Math, one Reading/Writing) with a break between, a
40-minute life skills workshop, and 10 minutes of shoutouts. Saturday
runs the same day at double length: four 25-minute academic sessions
with a 15-minute mid-break, a snack break, an 80-minute workshop, and
shoutouts. Weekly dose on either track: 100 minutes of mastery
academics plus 80 minutes of life skills. Positioning, Truth 1, guide
role, and licensing copy updated across all formats; Word exports
regenerated. Prices and financials unchanged.

Co-Authored-By: Claude Fable 5 <noreply@anthropic.com>
</commit_message>
<xml_diff>
--- a/Alpha-Hours-Business-Plan.docx
+++ b/Alpha-Hours-Business-Plan.docx
@@ -99,7 +99,7 @@
           <w:spacing w:val="0"/>
           <w:color w:val="E4E7F0"/>
         </w:rPr>
-        <w:t xml:space="preserve">Alpha Hours is a paid, premium after-school and Saturday program that runs inside Alpha School buildings after the regular school day ends and on weekends. Families who do not attend Alpha get the full Alpha academic day: their child works Math and Reading/Writing on Timeback, Alpha's AI mastery platform (formerly branded 2 Hour Learning), supported in person by guides hired and trained specifically for this program.</w:t>
+        <w:t xml:space="preserve">Alpha Hours is a paid, premium after-school and Saturday program that runs inside Alpha School buildings after the regular school day ends and on weekends. Families who do not attend Alpha get the complete Alpha day in miniature: their child works Math and Reading/Writing on Timeback, Alpha's AI mastery platform (formerly branded 2 Hour Learning), and takes part in a life skills workshop, supported in person by guides hired and trained specifically for this program.</w:t>
       </w:r>
     </w:p>
     <w:p>
@@ -295,7 +295,7 @@
           <w:spacing w:val="0"/>
           <w:color w:val="E4E7F0"/>
         </w:rPr>
-        <w:t xml:space="preserve">The full Alpha academic day, after school</w:t>
+        <w:t xml:space="preserve">The complete Alpha day, after school</w:t>
       </w:r>
     </w:p>
     <w:p>
@@ -310,7 +310,7 @@
           <w:spacing w:val="0"/>
           <w:color w:val="E4E7F0"/>
         </w:rPr>
-        <w:t xml:space="preserve">A normal Alpha day gives students about two hours of core academics on Timeback. Alpha Hours delivers that same two-hour academic day, after school. A family picks a two-night track, Monday/Wednesday or Tuesday/Thursday at 5:00 to 7:00 pm, or a single Saturday block of four hours, morning or afternoon. Either way the child gets four hours a week on the platform, the full Alpha academic dose, roughly half on Math and half on Reading/Writing, adjusting to wherever they need the time. The software delivers the instruction and adapts to each child. The guide manages focus, effort, and motivation. That is the whole model: the complete Alpha academic day, mastery-based, four hours a week.</w:t>
+        <w:t xml:space="preserve">An Alpha day runs on two things: mastery academics on Timeback and life skills workshops. Alpha Hours compresses that whole day into each sitting. A weekday sitting is two hours: a ten-minute Limitless launch, two 25-minute academic sessions on Timeback (one Math, one Reading/Writing) with a short break between, a 40-minute life skills workshop, and ten minutes of shoutouts. The Saturday block runs the same day at double length: four 25-minute academic sessions, an 80-minute workshop, and a snack break in the middle. Either way the child gets the same week: 100 minutes of focused, adaptive mastery academics and 80 minutes of life skills. The software delivers the instruction and adapts to each child. The guide holds focus, effort, and motivation, and leads the workshop. That is the whole model: the complete Alpha day, academics and life skills, in one sitting.</w:t>
       </w:r>
     </w:p>
     <w:p>
@@ -336,7 +336,7 @@
           <w:spacing w:val="0"/>
           <w:color w:val="E4E7F0"/>
         </w:rPr>
-        <w:t xml:space="preserve"> There is no single-subject option. Alpha Hours is one product, the full Alpha academic day, not a menu.</w:t>
+        <w:t xml:space="preserve"> There is no single-subject option. Alpha Hours is one product, the complete Alpha day, not a menu.</w:t>
       </w:r>
     </w:p>
     <w:p>
@@ -517,6 +517,262 @@
           <w:spacing w:val="0"/>
           <w:color w:val="E4E7F0"/>
         </w:rPr>
+        <w:t xml:space="preserve">Inside the two-hour weekday block:</w:t>
+      </w:r>
+    </w:p>
+    <w:p>
+      <w:pPr/>
+      <w:r>
+        <w:rPr>
+          <w:rFonts w:ascii=".SF NS" w:hAnsi=".SF NS" w:cs=".SF NS"/>
+          <w:sz w:val="22"/>
+          <w:sz-cs w:val="22"/>
+          <w:b/>
+          <w:spacing w:val="0"/>
+          <w:color w:val="5B667D"/>
+        </w:rPr>
+        <w:t xml:space="preserve">INSIDE THE TWO HOURS</w:t>
+      </w:r>
+    </w:p>
+    <w:p>
+      <w:pPr>
+        <w:jc w:val="right"/>
+      </w:pPr>
+      <w:r>
+        <w:rPr>
+          <w:rFonts w:ascii=".SF NS" w:hAnsi=".SF NS" w:cs=".SF NS"/>
+          <w:sz w:val="22"/>
+          <w:sz-cs w:val="22"/>
+          <w:b/>
+          <w:spacing w:val="0"/>
+          <w:color w:val="5B667D"/>
+        </w:rPr>
+        <w:t xml:space="preserve">MINUTES</w:t>
+      </w:r>
+    </w:p>
+    <w:p>
+      <w:pPr/>
+      <w:r>
+        <w:rPr>
+          <w:rFonts w:ascii=".SF NS" w:hAnsi=".SF NS" w:cs=".SF NS"/>
+          <w:sz w:val="28"/>
+          <w:sz-cs w:val="28"/>
+          <w:spacing w:val="0"/>
+          <w:color w:val="E4E7F0"/>
+        </w:rPr>
+        <w:t xml:space="preserve">Limitless launch</w:t>
+      </w:r>
+    </w:p>
+    <w:p>
+      <w:pPr>
+        <w:jc w:val="right"/>
+      </w:pPr>
+      <w:r>
+        <w:rPr>
+          <w:rFonts w:ascii="Helvetica Neue" w:hAnsi="Helvetica Neue" w:cs="Helvetica Neue"/>
+          <w:sz w:val="28"/>
+          <w:sz-cs w:val="28"/>
+          <w:spacing w:val="0"/>
+          <w:color w:val="E4E7F0"/>
+        </w:rPr>
+        <w:t xml:space="preserve">10</w:t>
+      </w:r>
+    </w:p>
+    <w:p>
+      <w:pPr/>
+      <w:r>
+        <w:rPr>
+          <w:rFonts w:ascii=".SF NS" w:hAnsi=".SF NS" w:cs=".SF NS"/>
+          <w:sz w:val="28"/>
+          <w:sz-cs w:val="28"/>
+          <w:spacing w:val="0"/>
+          <w:color w:val="E4E7F0"/>
+        </w:rPr>
+        <w:t xml:space="preserve">Academic session 1 (Timeback)</w:t>
+      </w:r>
+    </w:p>
+    <w:p>
+      <w:pPr>
+        <w:jc w:val="right"/>
+      </w:pPr>
+      <w:r>
+        <w:rPr>
+          <w:rFonts w:ascii="Helvetica Neue" w:hAnsi="Helvetica Neue" w:cs="Helvetica Neue"/>
+          <w:sz w:val="28"/>
+          <w:sz-cs w:val="28"/>
+          <w:spacing w:val="0"/>
+          <w:color w:val="E4E7F0"/>
+        </w:rPr>
+        <w:t xml:space="preserve">25</w:t>
+      </w:r>
+    </w:p>
+    <w:p>
+      <w:pPr/>
+      <w:r>
+        <w:rPr>
+          <w:rFonts w:ascii=".SF NS" w:hAnsi=".SF NS" w:cs=".SF NS"/>
+          <w:sz w:val="28"/>
+          <w:sz-cs w:val="28"/>
+          <w:spacing w:val="0"/>
+          <w:color w:val="E4E7F0"/>
+        </w:rPr>
+        <w:t xml:space="preserve">Break</w:t>
+      </w:r>
+    </w:p>
+    <w:p>
+      <w:pPr>
+        <w:jc w:val="right"/>
+      </w:pPr>
+      <w:r>
+        <w:rPr>
+          <w:rFonts w:ascii="Helvetica Neue" w:hAnsi="Helvetica Neue" w:cs="Helvetica Neue"/>
+          <w:sz w:val="28"/>
+          <w:sz-cs w:val="28"/>
+          <w:spacing w:val="0"/>
+          <w:color w:val="E4E7F0"/>
+        </w:rPr>
+        <w:t xml:space="preserve">5</w:t>
+      </w:r>
+    </w:p>
+    <w:p>
+      <w:pPr/>
+      <w:r>
+        <w:rPr>
+          <w:rFonts w:ascii=".SF NS" w:hAnsi=".SF NS" w:cs=".SF NS"/>
+          <w:sz w:val="28"/>
+          <w:sz-cs w:val="28"/>
+          <w:spacing w:val="0"/>
+          <w:color w:val="E4E7F0"/>
+        </w:rPr>
+        <w:t xml:space="preserve">Academic session 2 (Timeback)</w:t>
+      </w:r>
+    </w:p>
+    <w:p>
+      <w:pPr>
+        <w:jc w:val="right"/>
+      </w:pPr>
+      <w:r>
+        <w:rPr>
+          <w:rFonts w:ascii="Helvetica Neue" w:hAnsi="Helvetica Neue" w:cs="Helvetica Neue"/>
+          <w:sz w:val="28"/>
+          <w:sz-cs w:val="28"/>
+          <w:spacing w:val="0"/>
+          <w:color w:val="E4E7F0"/>
+        </w:rPr>
+        <w:t xml:space="preserve">25</w:t>
+      </w:r>
+    </w:p>
+    <w:p>
+      <w:pPr/>
+      <w:r>
+        <w:rPr>
+          <w:rFonts w:ascii=".SF NS" w:hAnsi=".SF NS" w:cs=".SF NS"/>
+          <w:sz w:val="28"/>
+          <w:sz-cs w:val="28"/>
+          <w:spacing w:val="0"/>
+          <w:color w:val="E4E7F0"/>
+        </w:rPr>
+        <w:t xml:space="preserve">Transition</w:t>
+      </w:r>
+    </w:p>
+    <w:p>
+      <w:pPr>
+        <w:jc w:val="right"/>
+      </w:pPr>
+      <w:r>
+        <w:rPr>
+          <w:rFonts w:ascii="Helvetica Neue" w:hAnsi="Helvetica Neue" w:cs="Helvetica Neue"/>
+          <w:sz w:val="28"/>
+          <w:sz-cs w:val="28"/>
+          <w:spacing w:val="0"/>
+          <w:color w:val="E4E7F0"/>
+        </w:rPr>
+        <w:t xml:space="preserve">5</w:t>
+      </w:r>
+    </w:p>
+    <w:p>
+      <w:pPr/>
+      <w:r>
+        <w:rPr>
+          <w:rFonts w:ascii=".SF NS" w:hAnsi=".SF NS" w:cs=".SF NS"/>
+          <w:sz w:val="28"/>
+          <w:sz-cs w:val="28"/>
+          <w:spacing w:val="0"/>
+          <w:color w:val="E4E7F0"/>
+        </w:rPr>
+        <w:t xml:space="preserve">Life skills workshop</w:t>
+      </w:r>
+    </w:p>
+    <w:p>
+      <w:pPr>
+        <w:jc w:val="right"/>
+      </w:pPr>
+      <w:r>
+        <w:rPr>
+          <w:rFonts w:ascii="Helvetica Neue" w:hAnsi="Helvetica Neue" w:cs="Helvetica Neue"/>
+          <w:sz w:val="28"/>
+          <w:sz-cs w:val="28"/>
+          <w:spacing w:val="0"/>
+          <w:color w:val="E4E7F0"/>
+        </w:rPr>
+        <w:t xml:space="preserve">40</w:t>
+      </w:r>
+    </w:p>
+    <w:p>
+      <w:pPr/>
+      <w:r>
+        <w:rPr>
+          <w:rFonts w:ascii=".SF NS" w:hAnsi=".SF NS" w:cs=".SF NS"/>
+          <w:sz w:val="28"/>
+          <w:sz-cs w:val="28"/>
+          <w:spacing w:val="0"/>
+          <w:color w:val="E4E7F0"/>
+        </w:rPr>
+        <w:t xml:space="preserve">Shoutouts</w:t>
+      </w:r>
+    </w:p>
+    <w:p>
+      <w:pPr>
+        <w:jc w:val="right"/>
+      </w:pPr>
+      <w:r>
+        <w:rPr>
+          <w:rFonts w:ascii="Helvetica Neue" w:hAnsi="Helvetica Neue" w:cs="Helvetica Neue"/>
+          <w:sz w:val="28"/>
+          <w:sz-cs w:val="28"/>
+          <w:spacing w:val="0"/>
+          <w:color w:val="E4E7F0"/>
+        </w:rPr>
+        <w:t xml:space="preserve">10</w:t>
+      </w:r>
+    </w:p>
+    <w:p>
+      <w:pPr>
+        <w:spacing w:after="280"/>
+      </w:pPr>
+      <w:r>
+        <w:rPr>
+          <w:rFonts w:ascii="Helvetica Neue" w:hAnsi="Helvetica Neue" w:cs="Helvetica Neue"/>
+          <w:sz w:val="24"/>
+          <w:sz-cs w:val="24"/>
+          <w:spacing w:val="0"/>
+          <w:color w:val="E4E7F0"/>
+        </w:rPr>
+        <w:t xml:space="preserve">Total 120 minutes. The two academic sessions are one Math, one Reading/Writing.</w:t>
+      </w:r>
+    </w:p>
+    <w:p>
+      <w:pPr>
+        <w:spacing w:after="280"/>
+      </w:pPr>
+      <w:r>
+        <w:rPr>
+          <w:rFonts w:ascii="Helvetica Neue" w:hAnsi="Helvetica Neue" w:cs="Helvetica Neue"/>
+          <w:sz w:val="24"/>
+          <w:sz-cs w:val="24"/>
+          <w:spacing w:val="0"/>
+          <w:color w:val="E4E7F0"/>
+        </w:rPr>
         <w:t xml:space="preserve">Saturday schedule:</w:t>
       </w:r>
     </w:p>
@@ -648,6 +904,374 @@
           <w:color w:val="E4E7F0"/>
         </w:rPr>
         <w:t xml:space="preserve">6:00 to 6:15 pm</w:t>
+      </w:r>
+    </w:p>
+    <w:p>
+      <w:pPr>
+        <w:spacing w:after="280"/>
+      </w:pPr>
+      <w:r>
+        <w:rPr>
+          <w:rFonts w:ascii="Helvetica Neue" w:hAnsi="Helvetica Neue" w:cs="Helvetica Neue"/>
+          <w:sz w:val="24"/>
+          <w:sz-cs w:val="24"/>
+          <w:spacing w:val="0"/>
+          <w:color w:val="E4E7F0"/>
+        </w:rPr>
+        <w:t xml:space="preserve">Inside the four-hour Saturday block:</w:t>
+      </w:r>
+    </w:p>
+    <w:p>
+      <w:pPr/>
+      <w:r>
+        <w:rPr>
+          <w:rFonts w:ascii=".SF NS" w:hAnsi=".SF NS" w:cs=".SF NS"/>
+          <w:sz w:val="22"/>
+          <w:sz-cs w:val="22"/>
+          <w:b/>
+          <w:spacing w:val="0"/>
+          <w:color w:val="5B667D"/>
+        </w:rPr>
+        <w:t xml:space="preserve">INSIDE THE FOUR HOURS</w:t>
+      </w:r>
+    </w:p>
+    <w:p>
+      <w:pPr>
+        <w:jc w:val="right"/>
+      </w:pPr>
+      <w:r>
+        <w:rPr>
+          <w:rFonts w:ascii=".SF NS" w:hAnsi=".SF NS" w:cs=".SF NS"/>
+          <w:sz w:val="22"/>
+          <w:sz-cs w:val="22"/>
+          <w:b/>
+          <w:spacing w:val="0"/>
+          <w:color w:val="5B667D"/>
+        </w:rPr>
+        <w:t xml:space="preserve">MINUTES</w:t>
+      </w:r>
+    </w:p>
+    <w:p>
+      <w:pPr/>
+      <w:r>
+        <w:rPr>
+          <w:rFonts w:ascii=".SF NS" w:hAnsi=".SF NS" w:cs=".SF NS"/>
+          <w:sz w:val="28"/>
+          <w:sz-cs w:val="28"/>
+          <w:spacing w:val="0"/>
+          <w:color w:val="E4E7F0"/>
+        </w:rPr>
+        <w:t xml:space="preserve">Limitless launch</w:t>
+      </w:r>
+    </w:p>
+    <w:p>
+      <w:pPr>
+        <w:jc w:val="right"/>
+      </w:pPr>
+      <w:r>
+        <w:rPr>
+          <w:rFonts w:ascii="Helvetica Neue" w:hAnsi="Helvetica Neue" w:cs="Helvetica Neue"/>
+          <w:sz w:val="28"/>
+          <w:sz-cs w:val="28"/>
+          <w:spacing w:val="0"/>
+          <w:color w:val="E4E7F0"/>
+        </w:rPr>
+        <w:t xml:space="preserve">10</w:t>
+      </w:r>
+    </w:p>
+    <w:p>
+      <w:pPr/>
+      <w:r>
+        <w:rPr>
+          <w:rFonts w:ascii=".SF NS" w:hAnsi=".SF NS" w:cs=".SF NS"/>
+          <w:sz w:val="28"/>
+          <w:sz-cs w:val="28"/>
+          <w:spacing w:val="0"/>
+          <w:color w:val="E4E7F0"/>
+        </w:rPr>
+        <w:t xml:space="preserve">Academic session 1 (Timeback)</w:t>
+      </w:r>
+    </w:p>
+    <w:p>
+      <w:pPr>
+        <w:jc w:val="right"/>
+      </w:pPr>
+      <w:r>
+        <w:rPr>
+          <w:rFonts w:ascii="Helvetica Neue" w:hAnsi="Helvetica Neue" w:cs="Helvetica Neue"/>
+          <w:sz w:val="28"/>
+          <w:sz-cs w:val="28"/>
+          <w:spacing w:val="0"/>
+          <w:color w:val="E4E7F0"/>
+        </w:rPr>
+        <w:t xml:space="preserve">25</w:t>
+      </w:r>
+    </w:p>
+    <w:p>
+      <w:pPr/>
+      <w:r>
+        <w:rPr>
+          <w:rFonts w:ascii=".SF NS" w:hAnsi=".SF NS" w:cs=".SF NS"/>
+          <w:sz w:val="28"/>
+          <w:sz-cs w:val="28"/>
+          <w:spacing w:val="0"/>
+          <w:color w:val="E4E7F0"/>
+        </w:rPr>
+        <w:t xml:space="preserve">Break</w:t>
+      </w:r>
+    </w:p>
+    <w:p>
+      <w:pPr>
+        <w:jc w:val="right"/>
+      </w:pPr>
+      <w:r>
+        <w:rPr>
+          <w:rFonts w:ascii="Helvetica Neue" w:hAnsi="Helvetica Neue" w:cs="Helvetica Neue"/>
+          <w:sz w:val="28"/>
+          <w:sz-cs w:val="28"/>
+          <w:spacing w:val="0"/>
+          <w:color w:val="E4E7F0"/>
+        </w:rPr>
+        <w:t xml:space="preserve">5</w:t>
+      </w:r>
+    </w:p>
+    <w:p>
+      <w:pPr/>
+      <w:r>
+        <w:rPr>
+          <w:rFonts w:ascii=".SF NS" w:hAnsi=".SF NS" w:cs=".SF NS"/>
+          <w:sz w:val="28"/>
+          <w:sz-cs w:val="28"/>
+          <w:spacing w:val="0"/>
+          <w:color w:val="E4E7F0"/>
+        </w:rPr>
+        <w:t xml:space="preserve">Academic session 2 (Timeback)</w:t>
+      </w:r>
+    </w:p>
+    <w:p>
+      <w:pPr>
+        <w:jc w:val="right"/>
+      </w:pPr>
+      <w:r>
+        <w:rPr>
+          <w:rFonts w:ascii="Helvetica Neue" w:hAnsi="Helvetica Neue" w:cs="Helvetica Neue"/>
+          <w:sz w:val="28"/>
+          <w:sz-cs w:val="28"/>
+          <w:spacing w:val="0"/>
+          <w:color w:val="E4E7F0"/>
+        </w:rPr>
+        <w:t xml:space="preserve">25</w:t>
+      </w:r>
+    </w:p>
+    <w:p>
+      <w:pPr/>
+      <w:r>
+        <w:rPr>
+          <w:rFonts w:ascii=".SF NS" w:hAnsi=".SF NS" w:cs=".SF NS"/>
+          <w:sz w:val="28"/>
+          <w:sz-cs w:val="28"/>
+          <w:spacing w:val="0"/>
+          <w:color w:val="E4E7F0"/>
+        </w:rPr>
+        <w:t xml:space="preserve">Break</w:t>
+      </w:r>
+    </w:p>
+    <w:p>
+      <w:pPr>
+        <w:jc w:val="right"/>
+      </w:pPr>
+      <w:r>
+        <w:rPr>
+          <w:rFonts w:ascii="Helvetica Neue" w:hAnsi="Helvetica Neue" w:cs="Helvetica Neue"/>
+          <w:sz w:val="28"/>
+          <w:sz-cs w:val="28"/>
+          <w:spacing w:val="0"/>
+          <w:color w:val="E4E7F0"/>
+        </w:rPr>
+        <w:t xml:space="preserve">15</w:t>
+      </w:r>
+    </w:p>
+    <w:p>
+      <w:pPr/>
+      <w:r>
+        <w:rPr>
+          <w:rFonts w:ascii=".SF NS" w:hAnsi=".SF NS" w:cs=".SF NS"/>
+          <w:sz w:val="28"/>
+          <w:sz-cs w:val="28"/>
+          <w:spacing w:val="0"/>
+          <w:color w:val="E4E7F0"/>
+        </w:rPr>
+        <w:t xml:space="preserve">Academic session 3 (Timeback)</w:t>
+      </w:r>
+    </w:p>
+    <w:p>
+      <w:pPr>
+        <w:jc w:val="right"/>
+      </w:pPr>
+      <w:r>
+        <w:rPr>
+          <w:rFonts w:ascii="Helvetica Neue" w:hAnsi="Helvetica Neue" w:cs="Helvetica Neue"/>
+          <w:sz w:val="28"/>
+          <w:sz-cs w:val="28"/>
+          <w:spacing w:val="0"/>
+          <w:color w:val="E4E7F0"/>
+        </w:rPr>
+        <w:t xml:space="preserve">25</w:t>
+      </w:r>
+    </w:p>
+    <w:p>
+      <w:pPr/>
+      <w:r>
+        <w:rPr>
+          <w:rFonts w:ascii=".SF NS" w:hAnsi=".SF NS" w:cs=".SF NS"/>
+          <w:sz w:val="28"/>
+          <w:sz-cs w:val="28"/>
+          <w:spacing w:val="0"/>
+          <w:color w:val="E4E7F0"/>
+        </w:rPr>
+        <w:t xml:space="preserve">Break</w:t>
+      </w:r>
+    </w:p>
+    <w:p>
+      <w:pPr>
+        <w:jc w:val="right"/>
+      </w:pPr>
+      <w:r>
+        <w:rPr>
+          <w:rFonts w:ascii="Helvetica Neue" w:hAnsi="Helvetica Neue" w:cs="Helvetica Neue"/>
+          <w:sz w:val="28"/>
+          <w:sz-cs w:val="28"/>
+          <w:spacing w:val="0"/>
+          <w:color w:val="E4E7F0"/>
+        </w:rPr>
+        <w:t xml:space="preserve">5</w:t>
+      </w:r>
+    </w:p>
+    <w:p>
+      <w:pPr/>
+      <w:r>
+        <w:rPr>
+          <w:rFonts w:ascii=".SF NS" w:hAnsi=".SF NS" w:cs=".SF NS"/>
+          <w:sz w:val="28"/>
+          <w:sz-cs w:val="28"/>
+          <w:spacing w:val="0"/>
+          <w:color w:val="E4E7F0"/>
+        </w:rPr>
+        <w:t xml:space="preserve">Academic session 4 (Timeback)</w:t>
+      </w:r>
+    </w:p>
+    <w:p>
+      <w:pPr>
+        <w:jc w:val="right"/>
+      </w:pPr>
+      <w:r>
+        <w:rPr>
+          <w:rFonts w:ascii="Helvetica Neue" w:hAnsi="Helvetica Neue" w:cs="Helvetica Neue"/>
+          <w:sz w:val="28"/>
+          <w:sz-cs w:val="28"/>
+          <w:spacing w:val="0"/>
+          <w:color w:val="E4E7F0"/>
+        </w:rPr>
+        <w:t xml:space="preserve">25</w:t>
+      </w:r>
+    </w:p>
+    <w:p>
+      <w:pPr/>
+      <w:r>
+        <w:rPr>
+          <w:rFonts w:ascii=".SF NS" w:hAnsi=".SF NS" w:cs=".SF NS"/>
+          <w:sz w:val="28"/>
+          <w:sz-cs w:val="28"/>
+          <w:spacing w:val="0"/>
+          <w:color w:val="E4E7F0"/>
+        </w:rPr>
+        <w:t xml:space="preserve">Snack break</w:t>
+      </w:r>
+    </w:p>
+    <w:p>
+      <w:pPr>
+        <w:jc w:val="right"/>
+      </w:pPr>
+      <w:r>
+        <w:rPr>
+          <w:rFonts w:ascii="Helvetica Neue" w:hAnsi="Helvetica Neue" w:cs="Helvetica Neue"/>
+          <w:sz w:val="28"/>
+          <w:sz-cs w:val="28"/>
+          <w:spacing w:val="0"/>
+          <w:color w:val="E4E7F0"/>
+        </w:rPr>
+        <w:t xml:space="preserve">15</w:t>
+      </w:r>
+    </w:p>
+    <w:p>
+      <w:pPr/>
+      <w:r>
+        <w:rPr>
+          <w:rFonts w:ascii=".SF NS" w:hAnsi=".SF NS" w:cs=".SF NS"/>
+          <w:sz w:val="28"/>
+          <w:sz-cs w:val="28"/>
+          <w:spacing w:val="0"/>
+          <w:color w:val="E4E7F0"/>
+        </w:rPr>
+        <w:t xml:space="preserve">Life skills workshop</w:t>
+      </w:r>
+    </w:p>
+    <w:p>
+      <w:pPr>
+        <w:jc w:val="right"/>
+      </w:pPr>
+      <w:r>
+        <w:rPr>
+          <w:rFonts w:ascii="Helvetica Neue" w:hAnsi="Helvetica Neue" w:cs="Helvetica Neue"/>
+          <w:sz w:val="28"/>
+          <w:sz-cs w:val="28"/>
+          <w:spacing w:val="0"/>
+          <w:color w:val="E4E7F0"/>
+        </w:rPr>
+        <w:t xml:space="preserve">80</w:t>
+      </w:r>
+    </w:p>
+    <w:p>
+      <w:pPr/>
+      <w:r>
+        <w:rPr>
+          <w:rFonts w:ascii=".SF NS" w:hAnsi=".SF NS" w:cs=".SF NS"/>
+          <w:sz w:val="28"/>
+          <w:sz-cs w:val="28"/>
+          <w:spacing w:val="0"/>
+          <w:color w:val="E4E7F0"/>
+        </w:rPr>
+        <w:t xml:space="preserve">Shoutouts</w:t>
+      </w:r>
+    </w:p>
+    <w:p>
+      <w:pPr>
+        <w:jc w:val="right"/>
+      </w:pPr>
+      <w:r>
+        <w:rPr>
+          <w:rFonts w:ascii="Helvetica Neue" w:hAnsi="Helvetica Neue" w:cs="Helvetica Neue"/>
+          <w:sz w:val="28"/>
+          <w:sz-cs w:val="28"/>
+          <w:spacing w:val="0"/>
+          <w:color w:val="E4E7F0"/>
+        </w:rPr>
+        <w:t xml:space="preserve">10</w:t>
+      </w:r>
+    </w:p>
+    <w:p>
+      <w:pPr>
+        <w:spacing w:after="280"/>
+      </w:pPr>
+      <w:r>
+        <w:rPr>
+          <w:rFonts w:ascii="Helvetica Neue" w:hAnsi="Helvetica Neue" w:cs="Helvetica Neue"/>
+          <w:sz w:val="24"/>
+          <w:sz-cs w:val="24"/>
+          <w:spacing w:val="0"/>
+          <w:color w:val="E4E7F0"/>
+        </w:rPr>
+        <w:t xml:space="preserve">Total 240 minutes. Four academic sessions: two Math, two Reading/Writing. Snacks only, no meals.</w:t>
       </w:r>
     </w:p>
     <w:p>
@@ -941,7 +1565,7 @@
           <w:spacing w:val="0"/>
           <w:color w:val="E4E7F0"/>
         </w:rPr>
-        <w:t xml:space="preserve"> Guides are not subject teachers. The platform teaches. Guides manage focus, effort, and motivation, which is what Alpha's own model relies on, so the training is short and the role is repeatable across sites.</w:t>
+        <w:t xml:space="preserve"> The platform teaches the academics. Guides do not teach academics; they hold focus, effort, and motivation, and lead the life skills workshop and the launch and shoutout rituals, which is what Alpha's own model relies on, so the training is short and the role is repeatable across sites.</w:t>
       </w:r>
     </w:p>
     <w:p>
@@ -2836,7 +3460,7 @@
           <w:spacing w:val="0"/>
           <w:color w:val="E4E7F0"/>
         </w:rPr>
-        <w:t xml:space="preserve">The platform teaches, so ratios can be leaner than active-instruction tutoring but should still read as premium. Because blocks are mixed K-8, staff each block at about </w:t>
+        <w:t xml:space="preserve">The platform teaches the academics, so ratios can be leaner than active-instruction tutoring but should still read as premium. Guides do not teach academics; they hold focus, effort, and motivation, and lead the life skills workshop and the launch and shoutout rituals. Because blocks are mixed K-8, staff each block at about </w:t>
       </w:r>
       <w:r>
         <w:rPr>
@@ -8200,7 +8824,7 @@
           <w:spacing w:val="0"/>
           <w:color w:val="E4E7F0"/>
         </w:rPr>
-        <w:t xml:space="preserve">The key question in every state is whether an evening or Saturday program counts as childcare or as exempt instruction. Alpha Hours is designed to qualify as instruction: structure and market it as academic instruction with a defined curriculum; avoid meals in states where they trigger licensing (Florida especially); sign a formal facility-use agreement with the host campus; and request a written exemption determination from each state agency before opening. Every block is a curriculum-driven instructional period; the Saturday four-hour block is structured as two two-hour instructional periods with a supervised break, and no lunch is served. Flag the Saturday format specifically in each state's written exemption request.</w:t>
+        <w:t xml:space="preserve">The key question in every state is whether an evening or Saturday program counts as childcare or as exempt instruction. Alpha Hours is designed to qualify as instruction: structure and market it as academic instruction with a defined curriculum; avoid meals in states where they trigger licensing (Florida especially); sign a formal facility-use agreement with the host campus; and request a written exemption determination from each state agency before opening. Every block is curriculum-driven instruction end to end: timed mastery-academics sessions on Timeback and a structured life skills workshop. Flag the Saturday format specifically in each state's written exemption request.</w:t>
       </w:r>
     </w:p>
     <w:p>

</xml_diff>